<commit_message>
feito primeira parte da atividade teorica
</commit_message>
<xml_diff>
--- a/SWE/topico1/atividade1.docx
+++ b/SWE/topico1/atividade1.docx
@@ -3,77 +3,1579 @@
 <w:document xmlns:wpc="http://schemas.microsoft.com/office/word/2010/wordprocessingCanvas" xmlns:cx="http://schemas.microsoft.com/office/drawing/2014/chartex" xmlns:cx1="http://schemas.microsoft.com/office/drawing/2015/9/8/chartex" xmlns:cx2="http://schemas.microsoft.com/office/drawing/2015/10/21/chartex" xmlns:cx3="http://schemas.microsoft.com/office/drawing/2016/5/9/chartex" xmlns:cx4="http://schemas.microsoft.com/office/drawing/2016/5/10/chartex" xmlns:cx5="http://schemas.microsoft.com/office/drawing/2016/5/11/chartex" xmlns:cx6="http://schemas.microsoft.com/office/drawing/2016/5/12/chartex" xmlns:cx7="http://schemas.microsoft.com/office/drawing/2016/5/13/chartex" xmlns:cx8="http://schemas.microsoft.com/office/drawing/2016/5/14/chartex" xmlns:mc="http://schemas.openxmlformats.org/markup-compatibility/2006" xmlns:aink="http://schemas.microsoft.com/office/drawing/2016/ink" xmlns:am3d="http://schemas.microsoft.com/office/drawing/2017/model3d" xmlns:o="urn:schemas-microsoft-com:office:office" xmlns:oel="http://schemas.microsoft.com/office/2019/extlst" xmlns:r="http://schemas.openxmlformats.org/officeDocument/2006/relationships" xmlns:m="http://schemas.openxmlformats.org/officeDocument/2006/math" xmlns:v="urn:schemas-microsoft-com:vml" xmlns:wp14="http://schemas.microsoft.com/office/word/2010/wordprocessingDrawing" xmlns:wp="http://schemas.openxmlformats.org/drawingml/2006/wordprocessingDrawing" xmlns:w10="urn:schemas-microsoft-com:office:word" xmlns:w="http://schemas.openxmlformats.org/wordprocessingml/2006/main" xmlns:w14="http://schemas.microsoft.com/office/word/2010/wordml" xmlns:w15="http://schemas.microsoft.com/office/word/2012/wordml" xmlns:w16cex="http://schemas.microsoft.com/office/word/2018/wordml/cex" xmlns:w16cid="http://schemas.microsoft.com/office/word/2016/wordml/cid" xmlns:w16="http://schemas.microsoft.com/office/word/2018/wordml" xmlns:w16du="http://schemas.microsoft.com/office/word/2023/wordml/word16du" xmlns:w16sdtdh="http://schemas.microsoft.com/office/word/2020/wordml/sdtdatahash" xmlns:w16sdtfl="http://schemas.microsoft.com/office/word/2024/wordml/sdtformatlock" xmlns:w16se="http://schemas.microsoft.com/office/word/2015/wordml/symex" xmlns:wpg="http://schemas.microsoft.com/office/word/2010/wordprocessingGroup" xmlns:wpi="http://schemas.microsoft.com/office/word/2010/wordprocessingInk" xmlns:wne="http://schemas.microsoft.com/office/word/2006/wordml" xmlns:wps="http://schemas.microsoft.com/office/word/2010/wordprocessingShape" mc:Ignorable="w14 w15 w16se w16cid w16 w16cex w16sdtdh w16sdtfl w16du wp14">
   <w:body>
     <w:p>
-      <w:r>
-        <w:t>usuario</w:t>
+      <w:pPr>
+        <w:rPr>
+          <w:b/>
+          <w:bCs/>
+        </w:rPr>
+      </w:pPr>
+      <w:r>
+        <w:rPr>
+          <w:b/>
+          <w:bCs/>
+          <w:noProof/>
+        </w:rPr>
+        <w:drawing>
+          <wp:anchor distT="0" distB="0" distL="114300" distR="114300" simplePos="0" relativeHeight="251658240" behindDoc="0" locked="0" layoutInCell="1" allowOverlap="1" wp14:anchorId="448A53DA" wp14:editId="38E2F495">
+            <wp:simplePos x="0" y="0"/>
+            <wp:positionH relativeFrom="column">
+              <wp:posOffset>1057901</wp:posOffset>
+            </wp:positionH>
+            <wp:positionV relativeFrom="paragraph">
+              <wp:posOffset>456652</wp:posOffset>
+            </wp:positionV>
+            <wp:extent cx="4552315" cy="8892540"/>
+            <wp:effectExtent l="0" t="0" r="635" b="3810"/>
+            <wp:wrapTopAndBottom/>
+            <wp:docPr id="1802149906" name="Imagem 1"/>
+            <wp:cNvGraphicFramePr>
+              <a:graphicFrameLocks xmlns:a="http://schemas.openxmlformats.org/drawingml/2006/main" noChangeAspect="1"/>
+            </wp:cNvGraphicFramePr>
+            <a:graphic xmlns:a="http://schemas.openxmlformats.org/drawingml/2006/main">
+              <a:graphicData uri="http://schemas.openxmlformats.org/drawingml/2006/picture">
+                <pic:pic xmlns:pic="http://schemas.openxmlformats.org/drawingml/2006/picture">
+                  <pic:nvPicPr>
+                    <pic:cNvPr id="1802149906" name="Imagem 1802149906"/>
+                    <pic:cNvPicPr/>
+                  </pic:nvPicPr>
+                  <pic:blipFill>
+                    <a:blip r:embed="rId5" cstate="print">
+                      <a:extLst>
+                        <a:ext uri="{28A0092B-C50C-407E-A947-70E740481C1C}">
+                          <a14:useLocalDpi xmlns:a14="http://schemas.microsoft.com/office/drawing/2010/main" val="0"/>
+                        </a:ext>
+                      </a:extLst>
+                    </a:blip>
+                    <a:stretch>
+                      <a:fillRect/>
+                    </a:stretch>
+                  </pic:blipFill>
+                  <pic:spPr>
+                    <a:xfrm>
+                      <a:off x="0" y="0"/>
+                      <a:ext cx="4552315" cy="8892540"/>
+                    </a:xfrm>
+                    <a:prstGeom prst="rect">
+                      <a:avLst/>
+                    </a:prstGeom>
+                  </pic:spPr>
+                </pic:pic>
+              </a:graphicData>
+            </a:graphic>
+          </wp:anchor>
+        </w:drawing>
       </w:r>
     </w:p>
     <w:p>
-      <w:r>
-        <w:t>Get</w:t>
-      </w:r>
-      <w:r>
-        <w:br/>
-        <w:t>kourts/funcionário/{id}</w:t>
-      </w:r>
-      <w:r>
-        <w:br/>
-        <w:t>retorna um json do funcionário que foi buscado pela url</w:t>
-      </w:r>
-      <w:r>
-        <w:br/>
-        <w:t>Na entrada não terá um Json somente o id na url e na saída terá um Json. Ex:</w:t>
-      </w:r>
-      <w:r>
-        <w:br/>
-      </w:r>
-      <w:r>
-        <w:t>{</w:t>
-      </w:r>
+      <w:pPr>
+        <w:rPr>
+          <w:b/>
+          <w:bCs/>
+        </w:rPr>
+      </w:pPr>
     </w:p>
     <w:p>
-      <w:r>
-        <w:t>    "email": "paulo@email.com",</w:t>
+      <w:pPr>
+        <w:rPr>
+          <w:b/>
+          <w:bCs/>
+        </w:rPr>
+      </w:pPr>
+      <w:r>
+        <w:rPr>
+          <w:b/>
+          <w:bCs/>
+        </w:rPr>
+        <w:lastRenderedPageBreak/>
+        <w:t>1. O Papel do Serviço Web (</w:t>
+      </w:r>
+      <w:proofErr w:type="spellStart"/>
+      <w:r>
+        <w:rPr>
+          <w:b/>
+          <w:bCs/>
+        </w:rPr>
+        <w:t>Backend</w:t>
+      </w:r>
+      <w:proofErr w:type="spellEnd"/>
+      <w:r>
+        <w:rPr>
+          <w:b/>
+          <w:bCs/>
+        </w:rPr>
+        <w:t>)</w:t>
       </w:r>
     </w:p>
     <w:p>
       <w:r>
-        <w:t>    "nome": "Paulo ",</w:t>
+        <w:t xml:space="preserve">Na arquitetura proposta, o </w:t>
+      </w:r>
+      <w:r>
+        <w:rPr>
+          <w:b/>
+          <w:bCs/>
+        </w:rPr>
+        <w:t>Serviço Web atua como o núcleo central (</w:t>
+      </w:r>
+      <w:proofErr w:type="spellStart"/>
+      <w:r>
+        <w:rPr>
+          <w:b/>
+          <w:bCs/>
+        </w:rPr>
+        <w:t>Backend</w:t>
+      </w:r>
+      <w:proofErr w:type="spellEnd"/>
+      <w:r>
+        <w:rPr>
+          <w:b/>
+          <w:bCs/>
+        </w:rPr>
+        <w:t xml:space="preserve">-as-a-Service ou API </w:t>
+      </w:r>
+      <w:proofErr w:type="spellStart"/>
+      <w:r>
+        <w:rPr>
+          <w:b/>
+          <w:bCs/>
+        </w:rPr>
+        <w:t>RESTful</w:t>
+      </w:r>
+      <w:proofErr w:type="spellEnd"/>
+      <w:r>
+        <w:rPr>
+          <w:b/>
+          <w:bCs/>
+        </w:rPr>
+        <w:t>)</w:t>
+      </w:r>
+      <w:r>
+        <w:t xml:space="preserve"> do sistema. Ele centraliza toda a inteligência da aplicação, garantindo que o Web e o Mobile funcionem apenas como interfaces de usuário (</w:t>
+      </w:r>
+      <w:proofErr w:type="spellStart"/>
+      <w:r>
+        <w:t>Frontends</w:t>
+      </w:r>
+      <w:proofErr w:type="spellEnd"/>
+      <w:r>
+        <w:t>).</w:t>
       </w:r>
     </w:p>
     <w:p>
       <w:r>
-        <w:t>    "senha": "ghost14@@",</w:t>
+        <w:t>Dentro do padrão arquitetural de software (como o MVC adaptado para APIs):</w:t>
       </w:r>
     </w:p>
     <w:p>
-      <w:r>
-        <w:t>    "telefone": "48998888999",</w:t>
+      <w:pPr>
+        <w:numPr>
+          <w:ilvl w:val="0"/>
+          <w:numId w:val="1"/>
+        </w:numPr>
+      </w:pPr>
+      <w:proofErr w:type="spellStart"/>
+      <w:r>
+        <w:rPr>
+          <w:b/>
+          <w:bCs/>
+        </w:rPr>
+        <w:t>Controller</w:t>
+      </w:r>
+      <w:proofErr w:type="spellEnd"/>
+      <w:r>
+        <w:rPr>
+          <w:b/>
+          <w:bCs/>
+        </w:rPr>
+        <w:t xml:space="preserve"> (Controlador):</w:t>
+      </w:r>
+      <w:r>
+        <w:t xml:space="preserve"> É a porta de entrada do Serviço Web. Ele recebe as requisições (</w:t>
+      </w:r>
+      <w:proofErr w:type="spellStart"/>
+      <w:r>
+        <w:t>requests</w:t>
+      </w:r>
+      <w:proofErr w:type="spellEnd"/>
+      <w:r>
+        <w:t xml:space="preserve">) vindas das aplicações Web e Mobile. Seu papel é expor os </w:t>
+      </w:r>
+      <w:proofErr w:type="spellStart"/>
+      <w:r>
+        <w:rPr>
+          <w:i/>
+          <w:iCs/>
+        </w:rPr>
+        <w:t>endpoints</w:t>
+      </w:r>
+      <w:proofErr w:type="spellEnd"/>
+      <w:r>
+        <w:t xml:space="preserve"> (URLs da API), interceptar a chamada, extrair os dados enviados pelos clientes (parâmetros, corpo da requisição), validar se a requisição está bem formatada e encaminhar a ação para a camada de Model. Ao final, ele recebe a resposta do Model e a formata para devolver ao cliente com o código de status HTTP adequado (</w:t>
+      </w:r>
+      <w:proofErr w:type="spellStart"/>
+      <w:r>
+        <w:t>ex</w:t>
+      </w:r>
+      <w:proofErr w:type="spellEnd"/>
+      <w:r>
+        <w:t xml:space="preserve">: 200 OK, 201 </w:t>
+      </w:r>
+      <w:proofErr w:type="spellStart"/>
+      <w:r>
+        <w:t>Created</w:t>
+      </w:r>
+      <w:proofErr w:type="spellEnd"/>
+      <w:r>
+        <w:t xml:space="preserve">, 400 </w:t>
+      </w:r>
+      <w:proofErr w:type="spellStart"/>
+      <w:r>
+        <w:t>Bad</w:t>
+      </w:r>
+      <w:proofErr w:type="spellEnd"/>
+      <w:r>
+        <w:t xml:space="preserve"> </w:t>
+      </w:r>
+      <w:proofErr w:type="spellStart"/>
+      <w:r>
+        <w:t>Request</w:t>
+      </w:r>
+      <w:proofErr w:type="spellEnd"/>
+      <w:r>
+        <w:t>).</w:t>
       </w:r>
     </w:p>
     <w:p>
-      <w:r>
-        <w:t>    "cpf": "123456789-12",</w:t>
+      <w:pPr>
+        <w:numPr>
+          <w:ilvl w:val="0"/>
+          <w:numId w:val="1"/>
+        </w:numPr>
+      </w:pPr>
+      <w:r>
+        <w:rPr>
+          <w:b/>
+          <w:bCs/>
+        </w:rPr>
+        <w:t>Model (Regras de Negócio e Acesso a Dados):</w:t>
+      </w:r>
+      <w:r>
+        <w:t xml:space="preserve"> É o coração do sistema. O Model garante que as lógicas e restrições da empresa sejam aplicadas de forma unificada. Independentemente de a requisição vir do celular ou do navegador, a regra para "calcular um desconto" ou "validar o saldo" é executada no mesmo lugar.</w:t>
       </w:r>
     </w:p>
     <w:p>
-      <w:r>
-        <w:t>    "sobrenome": "Dalmaso"</w:t>
+      <w:pPr>
+        <w:numPr>
+          <w:ilvl w:val="1"/>
+          <w:numId w:val="1"/>
+        </w:numPr>
+      </w:pPr>
+      <w:r>
+        <w:rPr>
+          <w:i/>
+          <w:iCs/>
+        </w:rPr>
+        <w:t>Acesso a Dados:</w:t>
+      </w:r>
+      <w:r>
+        <w:t xml:space="preserve"> Após processar a regra de negócio, a camada de Model (frequentemente usando um ORM - </w:t>
+      </w:r>
+      <w:proofErr w:type="spellStart"/>
+      <w:r>
+        <w:rPr>
+          <w:i/>
+          <w:iCs/>
+        </w:rPr>
+        <w:t>Object-Relational</w:t>
+      </w:r>
+      <w:proofErr w:type="spellEnd"/>
+      <w:r>
+        <w:rPr>
+          <w:i/>
+          <w:iCs/>
+        </w:rPr>
+        <w:t xml:space="preserve"> </w:t>
+      </w:r>
+      <w:proofErr w:type="spellStart"/>
+      <w:r>
+        <w:rPr>
+          <w:i/>
+          <w:iCs/>
+        </w:rPr>
+        <w:t>Mapper</w:t>
+      </w:r>
+      <w:proofErr w:type="spellEnd"/>
+      <w:r>
+        <w:t xml:space="preserve"> ou repositórios) interage com o Banco de Dados para realizar operações de CRUD (Criar, Ler, Atualizar, Deletar). O banco de dados é blindado; as aplicações clientes nunca o acessam diretamente, apenas através do Serviço Web.</w:t>
       </w:r>
     </w:p>
     <w:p>
       <w:r>
-        <w:t>}</w:t>
+        <w:pict w14:anchorId="5CFF5CEC">
+          <v:rect id="_x0000_i1037" style="width:0;height:1.5pt" o:hralign="center" o:hrstd="t" o:hr="t" fillcolor="#a0a0a0" stroked="f"/>
+        </w:pict>
+      </w:r>
+    </w:p>
+    <w:p>
+      <w:pPr>
+        <w:rPr>
+          <w:b/>
+          <w:bCs/>
+        </w:rPr>
+      </w:pPr>
+      <w:r>
+        <w:rPr>
+          <w:b/>
+          <w:bCs/>
+        </w:rPr>
+        <w:t>2. Consumo pelas Aplicações Web e Mobile</w:t>
+      </w:r>
+    </w:p>
+    <w:p>
+      <w:r>
+        <w:t>Tanto a Aplicação Web (</w:t>
+      </w:r>
+      <w:proofErr w:type="spellStart"/>
+      <w:r>
+        <w:t>ex</w:t>
+      </w:r>
+      <w:proofErr w:type="spellEnd"/>
+      <w:r>
+        <w:t xml:space="preserve">: desenvolvida em </w:t>
+      </w:r>
+      <w:proofErr w:type="spellStart"/>
+      <w:r>
+        <w:t>React</w:t>
+      </w:r>
+      <w:proofErr w:type="spellEnd"/>
+      <w:r>
+        <w:t xml:space="preserve">, </w:t>
+      </w:r>
+      <w:proofErr w:type="gramStart"/>
+      <w:r>
+        <w:t>Angular</w:t>
+      </w:r>
+      <w:proofErr w:type="gramEnd"/>
+      <w:r>
+        <w:t xml:space="preserve"> ou Vue.js) quanto a Aplicação Mobile (</w:t>
+      </w:r>
+      <w:proofErr w:type="spellStart"/>
+      <w:r>
+        <w:t>ex</w:t>
+      </w:r>
+      <w:proofErr w:type="spellEnd"/>
+      <w:r>
+        <w:t xml:space="preserve">: </w:t>
+      </w:r>
+      <w:proofErr w:type="spellStart"/>
+      <w:r>
+        <w:t>React</w:t>
+      </w:r>
+      <w:proofErr w:type="spellEnd"/>
+      <w:r>
+        <w:t xml:space="preserve"> </w:t>
+      </w:r>
+      <w:proofErr w:type="spellStart"/>
+      <w:r>
+        <w:t>Native</w:t>
+      </w:r>
+      <w:proofErr w:type="spellEnd"/>
+      <w:r>
+        <w:t xml:space="preserve">, </w:t>
+      </w:r>
+      <w:proofErr w:type="spellStart"/>
+      <w:r>
+        <w:t>Flutter</w:t>
+      </w:r>
+      <w:proofErr w:type="spellEnd"/>
+      <w:r>
+        <w:t xml:space="preserve">, Swift ou </w:t>
+      </w:r>
+      <w:proofErr w:type="spellStart"/>
+      <w:r>
+        <w:t>Kotlin</w:t>
+      </w:r>
+      <w:proofErr w:type="spellEnd"/>
+      <w:r>
+        <w:t xml:space="preserve">) atuarão como </w:t>
+      </w:r>
+      <w:r>
+        <w:rPr>
+          <w:b/>
+          <w:bCs/>
+        </w:rPr>
+        <w:t>clientes (</w:t>
+      </w:r>
+      <w:proofErr w:type="spellStart"/>
+      <w:r>
+        <w:rPr>
+          <w:b/>
+          <w:bCs/>
+        </w:rPr>
+        <w:t>consumers</w:t>
+      </w:r>
+      <w:proofErr w:type="spellEnd"/>
+      <w:r>
+        <w:rPr>
+          <w:b/>
+          <w:bCs/>
+        </w:rPr>
+        <w:t>)</w:t>
+      </w:r>
+      <w:r>
+        <w:t xml:space="preserve"> do Serviço Web.</w:t>
+      </w:r>
+    </w:p>
+    <w:p>
+      <w:pPr>
+        <w:numPr>
+          <w:ilvl w:val="0"/>
+          <w:numId w:val="2"/>
+        </w:numPr>
+      </w:pPr>
+      <w:r>
+        <w:rPr>
+          <w:b/>
+          <w:bCs/>
+        </w:rPr>
+        <w:t>Desacoplamento:</w:t>
+      </w:r>
+      <w:r>
+        <w:t xml:space="preserve"> Nenhuma regra de negócio crítica ou conexão direta ao banco de dados reside no Web ou no Mobile. Eles são responsáveis apenas pela </w:t>
+      </w:r>
+      <w:proofErr w:type="spellStart"/>
+      <w:r>
+        <w:rPr>
+          <w:b/>
+          <w:bCs/>
+        </w:rPr>
+        <w:t>View</w:t>
+      </w:r>
+      <w:proofErr w:type="spellEnd"/>
+      <w:r>
+        <w:t xml:space="preserve"> (apresentação visual e interação com o usuário).</w:t>
+      </w:r>
+    </w:p>
+    <w:p>
+      <w:pPr>
+        <w:numPr>
+          <w:ilvl w:val="0"/>
+          <w:numId w:val="2"/>
+        </w:numPr>
+      </w:pPr>
+      <w:r>
+        <w:rPr>
+          <w:b/>
+          <w:bCs/>
+        </w:rPr>
+        <w:t>Ação:</w:t>
+      </w:r>
+      <w:r>
+        <w:t xml:space="preserve"> Quando o usuário clica em um botão "Salvar" no aplicativo Mobile ou no site, o cliente empacota os dados preenchidos na tela e faz uma chamada assíncrona (via bibliotecas como </w:t>
+      </w:r>
+      <w:proofErr w:type="spellStart"/>
+      <w:r>
+        <w:t>fetch</w:t>
+      </w:r>
+      <w:proofErr w:type="spellEnd"/>
+      <w:r>
+        <w:t xml:space="preserve">, </w:t>
+      </w:r>
+      <w:proofErr w:type="spellStart"/>
+      <w:r>
+        <w:t>axios</w:t>
+      </w:r>
+      <w:proofErr w:type="spellEnd"/>
+      <w:r>
+        <w:t xml:space="preserve"> ou </w:t>
+      </w:r>
+      <w:proofErr w:type="spellStart"/>
+      <w:r>
+        <w:t>Retrofit</w:t>
+      </w:r>
+      <w:proofErr w:type="spellEnd"/>
+      <w:r>
+        <w:t xml:space="preserve">) para a URL do Serviço Web correspondente. O cliente então aguarda a resposta e atualiza a interface (exibindo uma mensagem de sucesso ou erro) com base no que o </w:t>
+      </w:r>
+      <w:proofErr w:type="spellStart"/>
+      <w:r>
+        <w:t>backend</w:t>
+      </w:r>
+      <w:proofErr w:type="spellEnd"/>
+      <w:r>
+        <w:t xml:space="preserve"> retornou.</w:t>
+      </w:r>
+    </w:p>
+    <w:p>
+      <w:r>
+        <w:pict w14:anchorId="4B9CBCC0">
+          <v:rect id="_x0000_i1038" style="width:0;height:1.5pt" o:hralign="center" o:hrstd="t" o:hr="t" fillcolor="#a0a0a0" stroked="f"/>
+        </w:pict>
+      </w:r>
+    </w:p>
+    <w:p>
+      <w:pPr>
+        <w:rPr>
+          <w:b/>
+          <w:bCs/>
+        </w:rPr>
+      </w:pPr>
+      <w:r>
+        <w:rPr>
+          <w:b/>
+          <w:bCs/>
+        </w:rPr>
+        <w:t>3. Protocolos e Formatos de Dados Escolhidos</w:t>
+      </w:r>
+    </w:p>
+    <w:p>
+      <w:pPr>
+        <w:rPr>
+          <w:b/>
+          <w:bCs/>
+        </w:rPr>
+      </w:pPr>
+      <w:r>
+        <w:rPr>
+          <w:b/>
+          <w:bCs/>
+        </w:rPr>
+        <w:t>Protocolo: HTTP / HTTPS sob o padrão REST</w:t>
+      </w:r>
+    </w:p>
+    <w:p>
+      <w:r>
+        <w:t xml:space="preserve">A comunicação entre os clientes (Web/Mobile) e o Serviço Web será feita utilizando o protocolo </w:t>
+      </w:r>
+      <w:r>
+        <w:rPr>
+          <w:b/>
+          <w:bCs/>
+        </w:rPr>
+        <w:t xml:space="preserve">HTTPS (Hyper </w:t>
+      </w:r>
+      <w:proofErr w:type="spellStart"/>
+      <w:r>
+        <w:rPr>
+          <w:b/>
+          <w:bCs/>
+        </w:rPr>
+        <w:t>Text</w:t>
+      </w:r>
+      <w:proofErr w:type="spellEnd"/>
+      <w:r>
+        <w:rPr>
+          <w:b/>
+          <w:bCs/>
+        </w:rPr>
+        <w:t xml:space="preserve"> </w:t>
+      </w:r>
+      <w:proofErr w:type="spellStart"/>
+      <w:r>
+        <w:rPr>
+          <w:b/>
+          <w:bCs/>
+        </w:rPr>
+        <w:t>Transfer</w:t>
+      </w:r>
+      <w:proofErr w:type="spellEnd"/>
+      <w:r>
+        <w:rPr>
+          <w:b/>
+          <w:bCs/>
+        </w:rPr>
+        <w:t xml:space="preserve"> </w:t>
+      </w:r>
+      <w:proofErr w:type="spellStart"/>
+      <w:r>
+        <w:rPr>
+          <w:b/>
+          <w:bCs/>
+        </w:rPr>
+        <w:t>Protocol</w:t>
+      </w:r>
+      <w:proofErr w:type="spellEnd"/>
+      <w:r>
+        <w:rPr>
+          <w:b/>
+          <w:bCs/>
+        </w:rPr>
+        <w:t xml:space="preserve"> </w:t>
+      </w:r>
+      <w:proofErr w:type="spellStart"/>
+      <w:r>
+        <w:rPr>
+          <w:b/>
+          <w:bCs/>
+        </w:rPr>
+        <w:t>Secure</w:t>
+      </w:r>
+      <w:proofErr w:type="spellEnd"/>
+      <w:r>
+        <w:rPr>
+          <w:b/>
+          <w:bCs/>
+        </w:rPr>
+        <w:t>)</w:t>
+      </w:r>
+      <w:r>
+        <w:t xml:space="preserve">, aplicando a arquitetura </w:t>
+      </w:r>
+      <w:r>
+        <w:rPr>
+          <w:b/>
+          <w:bCs/>
+        </w:rPr>
+        <w:t>REST (</w:t>
+      </w:r>
+      <w:proofErr w:type="spellStart"/>
+      <w:r>
+        <w:rPr>
+          <w:b/>
+          <w:bCs/>
+        </w:rPr>
+        <w:t>Representational</w:t>
+      </w:r>
+      <w:proofErr w:type="spellEnd"/>
+      <w:r>
+        <w:rPr>
+          <w:b/>
+          <w:bCs/>
+        </w:rPr>
+        <w:t xml:space="preserve"> </w:t>
+      </w:r>
+      <w:proofErr w:type="spellStart"/>
+      <w:r>
+        <w:rPr>
+          <w:b/>
+          <w:bCs/>
+        </w:rPr>
+        <w:t>State</w:t>
+      </w:r>
+      <w:proofErr w:type="spellEnd"/>
+      <w:r>
+        <w:rPr>
+          <w:b/>
+          <w:bCs/>
+        </w:rPr>
+        <w:t xml:space="preserve"> </w:t>
+      </w:r>
+      <w:proofErr w:type="spellStart"/>
+      <w:r>
+        <w:rPr>
+          <w:b/>
+          <w:bCs/>
+        </w:rPr>
+        <w:t>Transfer</w:t>
+      </w:r>
+      <w:proofErr w:type="spellEnd"/>
+      <w:r>
+        <w:rPr>
+          <w:b/>
+          <w:bCs/>
+        </w:rPr>
+        <w:t>)</w:t>
+      </w:r>
+      <w:r>
+        <w:t>.</w:t>
+      </w:r>
+    </w:p>
+    <w:p>
+      <w:pPr>
+        <w:numPr>
+          <w:ilvl w:val="0"/>
+          <w:numId w:val="3"/>
+        </w:numPr>
+      </w:pPr>
+      <w:r>
+        <w:rPr>
+          <w:b/>
+          <w:bCs/>
+        </w:rPr>
+        <w:lastRenderedPageBreak/>
+        <w:t>Justificativa Técnica:</w:t>
+      </w:r>
+      <w:r>
+        <w:t xml:space="preserve"> O HTTP é o padrão universal da web. Utilizar REST permite mapear operações diretamente aos verbos semânticos do HTTP (GET para leitura, POST para criação, PUT/PATCH para atualização, DELETE para exclusão). O uso do "S" (</w:t>
+      </w:r>
+      <w:proofErr w:type="spellStart"/>
+      <w:r>
+        <w:t>Secure</w:t>
+      </w:r>
+      <w:proofErr w:type="spellEnd"/>
+      <w:r>
+        <w:t>/TLS) é obrigatório para criptografar os dados em trânsito, protegendo informações sensíveis contra interceptações (</w:t>
+      </w:r>
+      <w:proofErr w:type="spellStart"/>
+      <w:r>
+        <w:rPr>
+          <w:i/>
+          <w:iCs/>
+        </w:rPr>
+        <w:t>man</w:t>
+      </w:r>
+      <w:proofErr w:type="spellEnd"/>
+      <w:r>
+        <w:rPr>
+          <w:i/>
+          <w:iCs/>
+        </w:rPr>
+        <w:t>-in-</w:t>
+      </w:r>
+      <w:proofErr w:type="spellStart"/>
+      <w:r>
+        <w:rPr>
+          <w:i/>
+          <w:iCs/>
+        </w:rPr>
+        <w:t>the</w:t>
+      </w:r>
+      <w:proofErr w:type="spellEnd"/>
+      <w:r>
+        <w:rPr>
+          <w:i/>
+          <w:iCs/>
+        </w:rPr>
+        <w:t>-</w:t>
+      </w:r>
+      <w:proofErr w:type="spellStart"/>
+      <w:r>
+        <w:rPr>
+          <w:i/>
+          <w:iCs/>
+        </w:rPr>
+        <w:t>middle</w:t>
+      </w:r>
+      <w:proofErr w:type="spellEnd"/>
+      <w:r>
+        <w:t xml:space="preserve">). Além disso, APIs REST são </w:t>
+      </w:r>
+      <w:proofErr w:type="spellStart"/>
+      <w:r>
+        <w:rPr>
+          <w:i/>
+          <w:iCs/>
+        </w:rPr>
+        <w:t>stateless</w:t>
+      </w:r>
+      <w:proofErr w:type="spellEnd"/>
+      <w:r>
+        <w:t xml:space="preserve"> (sem estado), o que significa que o servidor não precisa guardar a sessão do usuário entre as chamadas, facilitando imensamente a escalabilidade (adicionar mais servidores se o tráfego aumentar).</w:t>
+      </w:r>
+    </w:p>
+    <w:p>
+      <w:pPr>
+        <w:rPr>
+          <w:b/>
+          <w:bCs/>
+        </w:rPr>
+      </w:pPr>
+      <w:r>
+        <w:rPr>
+          <w:b/>
+          <w:bCs/>
+        </w:rPr>
+        <w:t>Formato de Representação: JSON (</w:t>
+      </w:r>
+      <w:proofErr w:type="spellStart"/>
+      <w:r>
+        <w:rPr>
+          <w:b/>
+          <w:bCs/>
+        </w:rPr>
+        <w:t>JavaScript</w:t>
+      </w:r>
+      <w:proofErr w:type="spellEnd"/>
+      <w:r>
+        <w:rPr>
+          <w:b/>
+          <w:bCs/>
+        </w:rPr>
+        <w:t xml:space="preserve"> </w:t>
+      </w:r>
+      <w:proofErr w:type="spellStart"/>
+      <w:r>
+        <w:rPr>
+          <w:b/>
+          <w:bCs/>
+        </w:rPr>
+        <w:t>Object</w:t>
+      </w:r>
+      <w:proofErr w:type="spellEnd"/>
+      <w:r>
+        <w:rPr>
+          <w:b/>
+          <w:bCs/>
+        </w:rPr>
+        <w:t xml:space="preserve"> </w:t>
+      </w:r>
+      <w:proofErr w:type="spellStart"/>
+      <w:r>
+        <w:rPr>
+          <w:b/>
+          <w:bCs/>
+        </w:rPr>
+        <w:t>Notation</w:t>
+      </w:r>
+      <w:proofErr w:type="spellEnd"/>
+      <w:r>
+        <w:rPr>
+          <w:b/>
+          <w:bCs/>
+        </w:rPr>
+        <w:t>)</w:t>
+      </w:r>
+    </w:p>
+    <w:p>
+      <w:r>
+        <w:t>O formato escolhido para envio e recebimento de dados (</w:t>
+      </w:r>
+      <w:proofErr w:type="spellStart"/>
+      <w:r>
+        <w:t>payload</w:t>
+      </w:r>
+      <w:proofErr w:type="spellEnd"/>
+      <w:r>
+        <w:t xml:space="preserve">) entre os clientes e o servidor será o </w:t>
+      </w:r>
+      <w:r>
+        <w:rPr>
+          <w:b/>
+          <w:bCs/>
+        </w:rPr>
+        <w:t>JSON</w:t>
+      </w:r>
+      <w:r>
+        <w:t>.</w:t>
+      </w:r>
+    </w:p>
+    <w:p>
+      <w:pPr>
+        <w:numPr>
+          <w:ilvl w:val="0"/>
+          <w:numId w:val="4"/>
+        </w:numPr>
+      </w:pPr>
+      <w:r>
+        <w:rPr>
+          <w:b/>
+          <w:bCs/>
+        </w:rPr>
+        <w:t>Justificativa Técnica:</w:t>
+      </w:r>
+      <w:r>
+        <w:t xml:space="preserve"> </w:t>
+      </w:r>
+    </w:p>
+    <w:p>
+      <w:pPr>
+        <w:numPr>
+          <w:ilvl w:val="0"/>
+          <w:numId w:val="4"/>
+        </w:numPr>
+      </w:pPr>
+      <w:r>
+        <w:t xml:space="preserve">1. </w:t>
+      </w:r>
+      <w:r>
+        <w:rPr>
+          <w:b/>
+          <w:bCs/>
+        </w:rPr>
+        <w:t>Leveza e Desempenho:</w:t>
+      </w:r>
+      <w:r>
+        <w:t xml:space="preserve"> JSON consome muito menos largura de banda e exige menos poder de processamento para ser analisado em comparação com o XML. Isso é crucial para a aplicação Mobile, que pode estar operando em redes 3G/4G instáveis.</w:t>
+      </w:r>
+    </w:p>
+    <w:p>
+      <w:pPr>
+        <w:numPr>
+          <w:ilvl w:val="0"/>
+          <w:numId w:val="4"/>
+        </w:numPr>
+      </w:pPr>
+      <w:r>
+        <w:t xml:space="preserve"> 2. </w:t>
+      </w:r>
+      <w:r>
+        <w:rPr>
+          <w:b/>
+          <w:bCs/>
+        </w:rPr>
+        <w:t>Integração Nativa com a Web:</w:t>
+      </w:r>
+      <w:r>
+        <w:t xml:space="preserve"> Como a aplicação Web será consumida por navegadores, o JSON possui compatibilidade nativa, tornando a serialização e </w:t>
+      </w:r>
+      <w:proofErr w:type="spellStart"/>
+      <w:r>
+        <w:t>desserialização</w:t>
+      </w:r>
+      <w:proofErr w:type="spellEnd"/>
+      <w:r>
+        <w:t xml:space="preserve"> triviais. </w:t>
+      </w:r>
+    </w:p>
+    <w:p>
+      <w:pPr>
+        <w:numPr>
+          <w:ilvl w:val="0"/>
+          <w:numId w:val="4"/>
+        </w:numPr>
+      </w:pPr>
+      <w:r>
+        <w:t xml:space="preserve">3. </w:t>
+      </w:r>
+      <w:r>
+        <w:rPr>
+          <w:b/>
+          <w:bCs/>
+        </w:rPr>
+        <w:t>Suporte Mobile:</w:t>
+      </w:r>
+      <w:r>
+        <w:t xml:space="preserve"> </w:t>
+      </w:r>
+      <w:proofErr w:type="gramStart"/>
+      <w:r>
+        <w:t>Todas as linguagens modernas de desenvolvimento mobile</w:t>
+      </w:r>
+      <w:proofErr w:type="gramEnd"/>
+      <w:r>
+        <w:t xml:space="preserve"> possuem bibliotecas altamente otimizadas e maduras para lidar com JSON, tornando a integração de dados direta e </w:t>
+      </w:r>
+      <w:proofErr w:type="spellStart"/>
+      <w:r>
+        <w:t>tipada</w:t>
+      </w:r>
+      <w:proofErr w:type="spellEnd"/>
+      <w:r>
+        <w:t xml:space="preserve"> de maneira muito mais limpa.</w:t>
       </w:r>
     </w:p>
     <w:p/>
     <w:sectPr>
       <w:pgSz w:w="11906" w:h="16838"/>
-      <w:pgMar w:top="1417" w:right="1701" w:bottom="1417" w:left="1701" w:header="708" w:footer="708" w:gutter="0"/>
+      <w:pgMar w:top="720" w:right="720" w:bottom="720" w:left="720" w:header="708" w:footer="708" w:gutter="0"/>
       <w:cols w:space="708"/>
       <w:docGrid w:linePitch="360"/>
     </w:sectPr>
   </w:body>
 </w:document>
+</file>
+
+<file path=word/numbering.xml><?xml version="1.0" encoding="utf-8"?>
+<w:numbering xmlns:wpc="http://schemas.microsoft.com/office/word/2010/wordprocessingCanvas" xmlns:cx="http://schemas.microsoft.com/office/drawing/2014/chartex" xmlns:cx1="http://schemas.microsoft.com/office/drawing/2015/9/8/chartex" xmlns:cx2="http://schemas.microsoft.com/office/drawing/2015/10/21/chartex" xmlns:cx3="http://schemas.microsoft.com/office/drawing/2016/5/9/chartex" xmlns:cx4="http://schemas.microsoft.com/office/drawing/2016/5/10/chartex" xmlns:cx5="http://schemas.microsoft.com/office/drawing/2016/5/11/chartex" xmlns:cx6="http://schemas.microsoft.com/office/drawing/2016/5/12/chartex" xmlns:cx7="http://schemas.microsoft.com/office/drawing/2016/5/13/chartex" xmlns:cx8="http://schemas.microsoft.com/office/drawing/2016/5/14/chartex" xmlns:mc="http://schemas.openxmlformats.org/markup-compatibility/2006" xmlns:aink="http://schemas.microsoft.com/office/drawing/2016/ink" xmlns:am3d="http://schemas.microsoft.com/office/drawing/2017/model3d" xmlns:o="urn:schemas-microsoft-com:office:office" xmlns:oel="http://schemas.microsoft.com/office/2019/extlst" xmlns:r="http://schemas.openxmlformats.org/officeDocument/2006/relationships" xmlns:m="http://schemas.openxmlformats.org/officeDocument/2006/math" xmlns:v="urn:schemas-microsoft-com:vml" xmlns:wp14="http://schemas.microsoft.com/office/word/2010/wordprocessingDrawing" xmlns:wp="http://schemas.openxmlformats.org/drawingml/2006/wordprocessingDrawing" xmlns:w10="urn:schemas-microsoft-com:office:word" xmlns:w="http://schemas.openxmlformats.org/wordprocessingml/2006/main" xmlns:w14="http://schemas.microsoft.com/office/word/2010/wordml" xmlns:w15="http://schemas.microsoft.com/office/word/2012/wordml" xmlns:w16cex="http://schemas.microsoft.com/office/word/2018/wordml/cex" xmlns:w16cid="http://schemas.microsoft.com/office/word/2016/wordml/cid" xmlns:w16="http://schemas.microsoft.com/office/word/2018/wordml" xmlns:w16du="http://schemas.microsoft.com/office/word/2023/wordml/word16du" xmlns:w16sdtdh="http://schemas.microsoft.com/office/word/2020/wordml/sdtdatahash" xmlns:w16sdtfl="http://schemas.microsoft.com/office/word/2024/wordml/sdtformatlock" xmlns:w16se="http://schemas.microsoft.com/office/word/2015/wordml/symex" xmlns:wpg="http://schemas.microsoft.com/office/word/2010/wordprocessingGroup" xmlns:wpi="http://schemas.microsoft.com/office/word/2010/wordprocessingInk" xmlns:wne="http://schemas.microsoft.com/office/word/2006/wordml" xmlns:wps="http://schemas.microsoft.com/office/word/2010/wordprocessingShape" mc:Ignorable="w14 w15 w16se w16cid w16 w16cex w16sdtdh w16sdtfl w16du wp14">
+  <w:abstractNum w:abstractNumId="0" w15:restartNumberingAfterBreak="0">
+    <w:nsid w:val="00112E75"/>
+    <w:multiLevelType w:val="multilevel"/>
+    <w:tmpl w:val="D54A0654"/>
+    <w:lvl w:ilvl="0">
+      <w:start w:val="1"/>
+      <w:numFmt w:val="bullet"/>
+      <w:lvlText w:val=""/>
+      <w:lvlJc w:val="left"/>
+      <w:pPr>
+        <w:tabs>
+          <w:tab w:val="num" w:pos="720"/>
+        </w:tabs>
+        <w:ind w:left="720" w:hanging="360"/>
+      </w:pPr>
+      <w:rPr>
+        <w:rFonts w:ascii="Symbol" w:hAnsi="Symbol" w:hint="default"/>
+        <w:sz w:val="20"/>
+      </w:rPr>
+    </w:lvl>
+    <w:lvl w:ilvl="1" w:tentative="1">
+      <w:start w:val="1"/>
+      <w:numFmt w:val="bullet"/>
+      <w:lvlText w:val="o"/>
+      <w:lvlJc w:val="left"/>
+      <w:pPr>
+        <w:tabs>
+          <w:tab w:val="num" w:pos="1440"/>
+        </w:tabs>
+        <w:ind w:left="1440" w:hanging="360"/>
+      </w:pPr>
+      <w:rPr>
+        <w:rFonts w:ascii="Courier New" w:hAnsi="Courier New" w:hint="default"/>
+        <w:sz w:val="20"/>
+      </w:rPr>
+    </w:lvl>
+    <w:lvl w:ilvl="2" w:tentative="1">
+      <w:start w:val="1"/>
+      <w:numFmt w:val="bullet"/>
+      <w:lvlText w:val=""/>
+      <w:lvlJc w:val="left"/>
+      <w:pPr>
+        <w:tabs>
+          <w:tab w:val="num" w:pos="2160"/>
+        </w:tabs>
+        <w:ind w:left="2160" w:hanging="360"/>
+      </w:pPr>
+      <w:rPr>
+        <w:rFonts w:ascii="Wingdings" w:hAnsi="Wingdings" w:hint="default"/>
+        <w:sz w:val="20"/>
+      </w:rPr>
+    </w:lvl>
+    <w:lvl w:ilvl="3" w:tentative="1">
+      <w:start w:val="1"/>
+      <w:numFmt w:val="bullet"/>
+      <w:lvlText w:val=""/>
+      <w:lvlJc w:val="left"/>
+      <w:pPr>
+        <w:tabs>
+          <w:tab w:val="num" w:pos="2880"/>
+        </w:tabs>
+        <w:ind w:left="2880" w:hanging="360"/>
+      </w:pPr>
+      <w:rPr>
+        <w:rFonts w:ascii="Wingdings" w:hAnsi="Wingdings" w:hint="default"/>
+        <w:sz w:val="20"/>
+      </w:rPr>
+    </w:lvl>
+    <w:lvl w:ilvl="4" w:tentative="1">
+      <w:start w:val="1"/>
+      <w:numFmt w:val="bullet"/>
+      <w:lvlText w:val=""/>
+      <w:lvlJc w:val="left"/>
+      <w:pPr>
+        <w:tabs>
+          <w:tab w:val="num" w:pos="3600"/>
+        </w:tabs>
+        <w:ind w:left="3600" w:hanging="360"/>
+      </w:pPr>
+      <w:rPr>
+        <w:rFonts w:ascii="Wingdings" w:hAnsi="Wingdings" w:hint="default"/>
+        <w:sz w:val="20"/>
+      </w:rPr>
+    </w:lvl>
+    <w:lvl w:ilvl="5" w:tentative="1">
+      <w:start w:val="1"/>
+      <w:numFmt w:val="bullet"/>
+      <w:lvlText w:val=""/>
+      <w:lvlJc w:val="left"/>
+      <w:pPr>
+        <w:tabs>
+          <w:tab w:val="num" w:pos="4320"/>
+        </w:tabs>
+        <w:ind w:left="4320" w:hanging="360"/>
+      </w:pPr>
+      <w:rPr>
+        <w:rFonts w:ascii="Wingdings" w:hAnsi="Wingdings" w:hint="default"/>
+        <w:sz w:val="20"/>
+      </w:rPr>
+    </w:lvl>
+    <w:lvl w:ilvl="6" w:tentative="1">
+      <w:start w:val="1"/>
+      <w:numFmt w:val="bullet"/>
+      <w:lvlText w:val=""/>
+      <w:lvlJc w:val="left"/>
+      <w:pPr>
+        <w:tabs>
+          <w:tab w:val="num" w:pos="5040"/>
+        </w:tabs>
+        <w:ind w:left="5040" w:hanging="360"/>
+      </w:pPr>
+      <w:rPr>
+        <w:rFonts w:ascii="Wingdings" w:hAnsi="Wingdings" w:hint="default"/>
+        <w:sz w:val="20"/>
+      </w:rPr>
+    </w:lvl>
+    <w:lvl w:ilvl="7" w:tentative="1">
+      <w:start w:val="1"/>
+      <w:numFmt w:val="bullet"/>
+      <w:lvlText w:val=""/>
+      <w:lvlJc w:val="left"/>
+      <w:pPr>
+        <w:tabs>
+          <w:tab w:val="num" w:pos="5760"/>
+        </w:tabs>
+        <w:ind w:left="5760" w:hanging="360"/>
+      </w:pPr>
+      <w:rPr>
+        <w:rFonts w:ascii="Wingdings" w:hAnsi="Wingdings" w:hint="default"/>
+        <w:sz w:val="20"/>
+      </w:rPr>
+    </w:lvl>
+    <w:lvl w:ilvl="8" w:tentative="1">
+      <w:start w:val="1"/>
+      <w:numFmt w:val="bullet"/>
+      <w:lvlText w:val=""/>
+      <w:lvlJc w:val="left"/>
+      <w:pPr>
+        <w:tabs>
+          <w:tab w:val="num" w:pos="6480"/>
+        </w:tabs>
+        <w:ind w:left="6480" w:hanging="360"/>
+      </w:pPr>
+      <w:rPr>
+        <w:rFonts w:ascii="Wingdings" w:hAnsi="Wingdings" w:hint="default"/>
+        <w:sz w:val="20"/>
+      </w:rPr>
+    </w:lvl>
+  </w:abstractNum>
+  <w:abstractNum w:abstractNumId="1" w15:restartNumberingAfterBreak="0">
+    <w:nsid w:val="027D2228"/>
+    <w:multiLevelType w:val="multilevel"/>
+    <w:tmpl w:val="47F88570"/>
+    <w:lvl w:ilvl="0">
+      <w:start w:val="1"/>
+      <w:numFmt w:val="bullet"/>
+      <w:lvlText w:val=""/>
+      <w:lvlJc w:val="left"/>
+      <w:pPr>
+        <w:tabs>
+          <w:tab w:val="num" w:pos="720"/>
+        </w:tabs>
+        <w:ind w:left="720" w:hanging="360"/>
+      </w:pPr>
+      <w:rPr>
+        <w:rFonts w:ascii="Symbol" w:hAnsi="Symbol" w:hint="default"/>
+        <w:sz w:val="20"/>
+      </w:rPr>
+    </w:lvl>
+    <w:lvl w:ilvl="1">
+      <w:start w:val="1"/>
+      <w:numFmt w:val="bullet"/>
+      <w:lvlText w:val="o"/>
+      <w:lvlJc w:val="left"/>
+      <w:pPr>
+        <w:tabs>
+          <w:tab w:val="num" w:pos="1440"/>
+        </w:tabs>
+        <w:ind w:left="1440" w:hanging="360"/>
+      </w:pPr>
+      <w:rPr>
+        <w:rFonts w:ascii="Courier New" w:hAnsi="Courier New" w:hint="default"/>
+        <w:sz w:val="20"/>
+      </w:rPr>
+    </w:lvl>
+    <w:lvl w:ilvl="2" w:tentative="1">
+      <w:start w:val="1"/>
+      <w:numFmt w:val="bullet"/>
+      <w:lvlText w:val=""/>
+      <w:lvlJc w:val="left"/>
+      <w:pPr>
+        <w:tabs>
+          <w:tab w:val="num" w:pos="2160"/>
+        </w:tabs>
+        <w:ind w:left="2160" w:hanging="360"/>
+      </w:pPr>
+      <w:rPr>
+        <w:rFonts w:ascii="Wingdings" w:hAnsi="Wingdings" w:hint="default"/>
+        <w:sz w:val="20"/>
+      </w:rPr>
+    </w:lvl>
+    <w:lvl w:ilvl="3" w:tentative="1">
+      <w:start w:val="1"/>
+      <w:numFmt w:val="bullet"/>
+      <w:lvlText w:val=""/>
+      <w:lvlJc w:val="left"/>
+      <w:pPr>
+        <w:tabs>
+          <w:tab w:val="num" w:pos="2880"/>
+        </w:tabs>
+        <w:ind w:left="2880" w:hanging="360"/>
+      </w:pPr>
+      <w:rPr>
+        <w:rFonts w:ascii="Wingdings" w:hAnsi="Wingdings" w:hint="default"/>
+        <w:sz w:val="20"/>
+      </w:rPr>
+    </w:lvl>
+    <w:lvl w:ilvl="4" w:tentative="1">
+      <w:start w:val="1"/>
+      <w:numFmt w:val="bullet"/>
+      <w:lvlText w:val=""/>
+      <w:lvlJc w:val="left"/>
+      <w:pPr>
+        <w:tabs>
+          <w:tab w:val="num" w:pos="3600"/>
+        </w:tabs>
+        <w:ind w:left="3600" w:hanging="360"/>
+      </w:pPr>
+      <w:rPr>
+        <w:rFonts w:ascii="Wingdings" w:hAnsi="Wingdings" w:hint="default"/>
+        <w:sz w:val="20"/>
+      </w:rPr>
+    </w:lvl>
+    <w:lvl w:ilvl="5" w:tentative="1">
+      <w:start w:val="1"/>
+      <w:numFmt w:val="bullet"/>
+      <w:lvlText w:val=""/>
+      <w:lvlJc w:val="left"/>
+      <w:pPr>
+        <w:tabs>
+          <w:tab w:val="num" w:pos="4320"/>
+        </w:tabs>
+        <w:ind w:left="4320" w:hanging="360"/>
+      </w:pPr>
+      <w:rPr>
+        <w:rFonts w:ascii="Wingdings" w:hAnsi="Wingdings" w:hint="default"/>
+        <w:sz w:val="20"/>
+      </w:rPr>
+    </w:lvl>
+    <w:lvl w:ilvl="6" w:tentative="1">
+      <w:start w:val="1"/>
+      <w:numFmt w:val="bullet"/>
+      <w:lvlText w:val=""/>
+      <w:lvlJc w:val="left"/>
+      <w:pPr>
+        <w:tabs>
+          <w:tab w:val="num" w:pos="5040"/>
+        </w:tabs>
+        <w:ind w:left="5040" w:hanging="360"/>
+      </w:pPr>
+      <w:rPr>
+        <w:rFonts w:ascii="Wingdings" w:hAnsi="Wingdings" w:hint="default"/>
+        <w:sz w:val="20"/>
+      </w:rPr>
+    </w:lvl>
+    <w:lvl w:ilvl="7" w:tentative="1">
+      <w:start w:val="1"/>
+      <w:numFmt w:val="bullet"/>
+      <w:lvlText w:val=""/>
+      <w:lvlJc w:val="left"/>
+      <w:pPr>
+        <w:tabs>
+          <w:tab w:val="num" w:pos="5760"/>
+        </w:tabs>
+        <w:ind w:left="5760" w:hanging="360"/>
+      </w:pPr>
+      <w:rPr>
+        <w:rFonts w:ascii="Wingdings" w:hAnsi="Wingdings" w:hint="default"/>
+        <w:sz w:val="20"/>
+      </w:rPr>
+    </w:lvl>
+    <w:lvl w:ilvl="8" w:tentative="1">
+      <w:start w:val="1"/>
+      <w:numFmt w:val="bullet"/>
+      <w:lvlText w:val=""/>
+      <w:lvlJc w:val="left"/>
+      <w:pPr>
+        <w:tabs>
+          <w:tab w:val="num" w:pos="6480"/>
+        </w:tabs>
+        <w:ind w:left="6480" w:hanging="360"/>
+      </w:pPr>
+      <w:rPr>
+        <w:rFonts w:ascii="Wingdings" w:hAnsi="Wingdings" w:hint="default"/>
+        <w:sz w:val="20"/>
+      </w:rPr>
+    </w:lvl>
+  </w:abstractNum>
+  <w:abstractNum w:abstractNumId="2" w15:restartNumberingAfterBreak="0">
+    <w:nsid w:val="2391364C"/>
+    <w:multiLevelType w:val="multilevel"/>
+    <w:tmpl w:val="8872035A"/>
+    <w:lvl w:ilvl="0">
+      <w:start w:val="1"/>
+      <w:numFmt w:val="bullet"/>
+      <w:lvlText w:val=""/>
+      <w:lvlJc w:val="left"/>
+      <w:pPr>
+        <w:tabs>
+          <w:tab w:val="num" w:pos="720"/>
+        </w:tabs>
+        <w:ind w:left="720" w:hanging="360"/>
+      </w:pPr>
+      <w:rPr>
+        <w:rFonts w:ascii="Symbol" w:hAnsi="Symbol" w:hint="default"/>
+        <w:sz w:val="20"/>
+      </w:rPr>
+    </w:lvl>
+    <w:lvl w:ilvl="1" w:tentative="1">
+      <w:start w:val="1"/>
+      <w:numFmt w:val="bullet"/>
+      <w:lvlText w:val="o"/>
+      <w:lvlJc w:val="left"/>
+      <w:pPr>
+        <w:tabs>
+          <w:tab w:val="num" w:pos="1440"/>
+        </w:tabs>
+        <w:ind w:left="1440" w:hanging="360"/>
+      </w:pPr>
+      <w:rPr>
+        <w:rFonts w:ascii="Courier New" w:hAnsi="Courier New" w:hint="default"/>
+        <w:sz w:val="20"/>
+      </w:rPr>
+    </w:lvl>
+    <w:lvl w:ilvl="2" w:tentative="1">
+      <w:start w:val="1"/>
+      <w:numFmt w:val="bullet"/>
+      <w:lvlText w:val=""/>
+      <w:lvlJc w:val="left"/>
+      <w:pPr>
+        <w:tabs>
+          <w:tab w:val="num" w:pos="2160"/>
+        </w:tabs>
+        <w:ind w:left="2160" w:hanging="360"/>
+      </w:pPr>
+      <w:rPr>
+        <w:rFonts w:ascii="Wingdings" w:hAnsi="Wingdings" w:hint="default"/>
+        <w:sz w:val="20"/>
+      </w:rPr>
+    </w:lvl>
+    <w:lvl w:ilvl="3" w:tentative="1">
+      <w:start w:val="1"/>
+      <w:numFmt w:val="bullet"/>
+      <w:lvlText w:val=""/>
+      <w:lvlJc w:val="left"/>
+      <w:pPr>
+        <w:tabs>
+          <w:tab w:val="num" w:pos="2880"/>
+        </w:tabs>
+        <w:ind w:left="2880" w:hanging="360"/>
+      </w:pPr>
+      <w:rPr>
+        <w:rFonts w:ascii="Wingdings" w:hAnsi="Wingdings" w:hint="default"/>
+        <w:sz w:val="20"/>
+      </w:rPr>
+    </w:lvl>
+    <w:lvl w:ilvl="4" w:tentative="1">
+      <w:start w:val="1"/>
+      <w:numFmt w:val="bullet"/>
+      <w:lvlText w:val=""/>
+      <w:lvlJc w:val="left"/>
+      <w:pPr>
+        <w:tabs>
+          <w:tab w:val="num" w:pos="3600"/>
+        </w:tabs>
+        <w:ind w:left="3600" w:hanging="360"/>
+      </w:pPr>
+      <w:rPr>
+        <w:rFonts w:ascii="Wingdings" w:hAnsi="Wingdings" w:hint="default"/>
+        <w:sz w:val="20"/>
+      </w:rPr>
+    </w:lvl>
+    <w:lvl w:ilvl="5" w:tentative="1">
+      <w:start w:val="1"/>
+      <w:numFmt w:val="bullet"/>
+      <w:lvlText w:val=""/>
+      <w:lvlJc w:val="left"/>
+      <w:pPr>
+        <w:tabs>
+          <w:tab w:val="num" w:pos="4320"/>
+        </w:tabs>
+        <w:ind w:left="4320" w:hanging="360"/>
+      </w:pPr>
+      <w:rPr>
+        <w:rFonts w:ascii="Wingdings" w:hAnsi="Wingdings" w:hint="default"/>
+        <w:sz w:val="20"/>
+      </w:rPr>
+    </w:lvl>
+    <w:lvl w:ilvl="6" w:tentative="1">
+      <w:start w:val="1"/>
+      <w:numFmt w:val="bullet"/>
+      <w:lvlText w:val=""/>
+      <w:lvlJc w:val="left"/>
+      <w:pPr>
+        <w:tabs>
+          <w:tab w:val="num" w:pos="5040"/>
+        </w:tabs>
+        <w:ind w:left="5040" w:hanging="360"/>
+      </w:pPr>
+      <w:rPr>
+        <w:rFonts w:ascii="Wingdings" w:hAnsi="Wingdings" w:hint="default"/>
+        <w:sz w:val="20"/>
+      </w:rPr>
+    </w:lvl>
+    <w:lvl w:ilvl="7" w:tentative="1">
+      <w:start w:val="1"/>
+      <w:numFmt w:val="bullet"/>
+      <w:lvlText w:val=""/>
+      <w:lvlJc w:val="left"/>
+      <w:pPr>
+        <w:tabs>
+          <w:tab w:val="num" w:pos="5760"/>
+        </w:tabs>
+        <w:ind w:left="5760" w:hanging="360"/>
+      </w:pPr>
+      <w:rPr>
+        <w:rFonts w:ascii="Wingdings" w:hAnsi="Wingdings" w:hint="default"/>
+        <w:sz w:val="20"/>
+      </w:rPr>
+    </w:lvl>
+    <w:lvl w:ilvl="8" w:tentative="1">
+      <w:start w:val="1"/>
+      <w:numFmt w:val="bullet"/>
+      <w:lvlText w:val=""/>
+      <w:lvlJc w:val="left"/>
+      <w:pPr>
+        <w:tabs>
+          <w:tab w:val="num" w:pos="6480"/>
+        </w:tabs>
+        <w:ind w:left="6480" w:hanging="360"/>
+      </w:pPr>
+      <w:rPr>
+        <w:rFonts w:ascii="Wingdings" w:hAnsi="Wingdings" w:hint="default"/>
+        <w:sz w:val="20"/>
+      </w:rPr>
+    </w:lvl>
+  </w:abstractNum>
+  <w:abstractNum w:abstractNumId="3" w15:restartNumberingAfterBreak="0">
+    <w:nsid w:val="493256B0"/>
+    <w:multiLevelType w:val="multilevel"/>
+    <w:tmpl w:val="D6C4A07E"/>
+    <w:lvl w:ilvl="0">
+      <w:start w:val="1"/>
+      <w:numFmt w:val="bullet"/>
+      <w:lvlText w:val=""/>
+      <w:lvlJc w:val="left"/>
+      <w:pPr>
+        <w:tabs>
+          <w:tab w:val="num" w:pos="720"/>
+        </w:tabs>
+        <w:ind w:left="720" w:hanging="360"/>
+      </w:pPr>
+      <w:rPr>
+        <w:rFonts w:ascii="Symbol" w:hAnsi="Symbol" w:hint="default"/>
+        <w:sz w:val="20"/>
+      </w:rPr>
+    </w:lvl>
+    <w:lvl w:ilvl="1" w:tentative="1">
+      <w:start w:val="1"/>
+      <w:numFmt w:val="bullet"/>
+      <w:lvlText w:val="o"/>
+      <w:lvlJc w:val="left"/>
+      <w:pPr>
+        <w:tabs>
+          <w:tab w:val="num" w:pos="1440"/>
+        </w:tabs>
+        <w:ind w:left="1440" w:hanging="360"/>
+      </w:pPr>
+      <w:rPr>
+        <w:rFonts w:ascii="Courier New" w:hAnsi="Courier New" w:hint="default"/>
+        <w:sz w:val="20"/>
+      </w:rPr>
+    </w:lvl>
+    <w:lvl w:ilvl="2" w:tentative="1">
+      <w:start w:val="1"/>
+      <w:numFmt w:val="bullet"/>
+      <w:lvlText w:val=""/>
+      <w:lvlJc w:val="left"/>
+      <w:pPr>
+        <w:tabs>
+          <w:tab w:val="num" w:pos="2160"/>
+        </w:tabs>
+        <w:ind w:left="2160" w:hanging="360"/>
+      </w:pPr>
+      <w:rPr>
+        <w:rFonts w:ascii="Wingdings" w:hAnsi="Wingdings" w:hint="default"/>
+        <w:sz w:val="20"/>
+      </w:rPr>
+    </w:lvl>
+    <w:lvl w:ilvl="3" w:tentative="1">
+      <w:start w:val="1"/>
+      <w:numFmt w:val="bullet"/>
+      <w:lvlText w:val=""/>
+      <w:lvlJc w:val="left"/>
+      <w:pPr>
+        <w:tabs>
+          <w:tab w:val="num" w:pos="2880"/>
+        </w:tabs>
+        <w:ind w:left="2880" w:hanging="360"/>
+      </w:pPr>
+      <w:rPr>
+        <w:rFonts w:ascii="Wingdings" w:hAnsi="Wingdings" w:hint="default"/>
+        <w:sz w:val="20"/>
+      </w:rPr>
+    </w:lvl>
+    <w:lvl w:ilvl="4" w:tentative="1">
+      <w:start w:val="1"/>
+      <w:numFmt w:val="bullet"/>
+      <w:lvlText w:val=""/>
+      <w:lvlJc w:val="left"/>
+      <w:pPr>
+        <w:tabs>
+          <w:tab w:val="num" w:pos="3600"/>
+        </w:tabs>
+        <w:ind w:left="3600" w:hanging="360"/>
+      </w:pPr>
+      <w:rPr>
+        <w:rFonts w:ascii="Wingdings" w:hAnsi="Wingdings" w:hint="default"/>
+        <w:sz w:val="20"/>
+      </w:rPr>
+    </w:lvl>
+    <w:lvl w:ilvl="5" w:tentative="1">
+      <w:start w:val="1"/>
+      <w:numFmt w:val="bullet"/>
+      <w:lvlText w:val=""/>
+      <w:lvlJc w:val="left"/>
+      <w:pPr>
+        <w:tabs>
+          <w:tab w:val="num" w:pos="4320"/>
+        </w:tabs>
+        <w:ind w:left="4320" w:hanging="360"/>
+      </w:pPr>
+      <w:rPr>
+        <w:rFonts w:ascii="Wingdings" w:hAnsi="Wingdings" w:hint="default"/>
+        <w:sz w:val="20"/>
+      </w:rPr>
+    </w:lvl>
+    <w:lvl w:ilvl="6" w:tentative="1">
+      <w:start w:val="1"/>
+      <w:numFmt w:val="bullet"/>
+      <w:lvlText w:val=""/>
+      <w:lvlJc w:val="left"/>
+      <w:pPr>
+        <w:tabs>
+          <w:tab w:val="num" w:pos="5040"/>
+        </w:tabs>
+        <w:ind w:left="5040" w:hanging="360"/>
+      </w:pPr>
+      <w:rPr>
+        <w:rFonts w:ascii="Wingdings" w:hAnsi="Wingdings" w:hint="default"/>
+        <w:sz w:val="20"/>
+      </w:rPr>
+    </w:lvl>
+    <w:lvl w:ilvl="7" w:tentative="1">
+      <w:start w:val="1"/>
+      <w:numFmt w:val="bullet"/>
+      <w:lvlText w:val=""/>
+      <w:lvlJc w:val="left"/>
+      <w:pPr>
+        <w:tabs>
+          <w:tab w:val="num" w:pos="5760"/>
+        </w:tabs>
+        <w:ind w:left="5760" w:hanging="360"/>
+      </w:pPr>
+      <w:rPr>
+        <w:rFonts w:ascii="Wingdings" w:hAnsi="Wingdings" w:hint="default"/>
+        <w:sz w:val="20"/>
+      </w:rPr>
+    </w:lvl>
+    <w:lvl w:ilvl="8" w:tentative="1">
+      <w:start w:val="1"/>
+      <w:numFmt w:val="bullet"/>
+      <w:lvlText w:val=""/>
+      <w:lvlJc w:val="left"/>
+      <w:pPr>
+        <w:tabs>
+          <w:tab w:val="num" w:pos="6480"/>
+        </w:tabs>
+        <w:ind w:left="6480" w:hanging="360"/>
+      </w:pPr>
+      <w:rPr>
+        <w:rFonts w:ascii="Wingdings" w:hAnsi="Wingdings" w:hint="default"/>
+        <w:sz w:val="20"/>
+      </w:rPr>
+    </w:lvl>
+  </w:abstractNum>
+  <w:num w:numId="1" w16cid:durableId="1306199194">
+    <w:abstractNumId w:val="1"/>
+  </w:num>
+  <w:num w:numId="2" w16cid:durableId="1312321033">
+    <w:abstractNumId w:val="3"/>
+  </w:num>
+  <w:num w:numId="3" w16cid:durableId="67459351">
+    <w:abstractNumId w:val="2"/>
+  </w:num>
+  <w:num w:numId="4" w16cid:durableId="404843130">
+    <w:abstractNumId w:val="0"/>
+  </w:num>
+</w:numbering>
 </file>
 
 <file path=word/styles.xml><?xml version="1.0" encoding="utf-8"?>
@@ -484,7 +1986,7 @@
     <w:link w:val="Ttulo1Char"/>
     <w:uiPriority w:val="9"/>
     <w:qFormat/>
-    <w:rsid w:val="00D67BB9"/>
+    <w:rsid w:val="00A02481"/>
     <w:pPr>
       <w:keepNext/>
       <w:keepLines/>
@@ -507,7 +2009,7 @@
     <w:semiHidden/>
     <w:unhideWhenUsed/>
     <w:qFormat/>
-    <w:rsid w:val="00D67BB9"/>
+    <w:rsid w:val="00A02481"/>
     <w:pPr>
       <w:keepNext/>
       <w:keepLines/>
@@ -530,7 +2032,7 @@
     <w:semiHidden/>
     <w:unhideWhenUsed/>
     <w:qFormat/>
-    <w:rsid w:val="00D67BB9"/>
+    <w:rsid w:val="00A02481"/>
     <w:pPr>
       <w:keepNext/>
       <w:keepLines/>
@@ -553,7 +2055,7 @@
     <w:semiHidden/>
     <w:unhideWhenUsed/>
     <w:qFormat/>
-    <w:rsid w:val="00D67BB9"/>
+    <w:rsid w:val="00A02481"/>
     <w:pPr>
       <w:keepNext/>
       <w:keepLines/>
@@ -576,7 +2078,7 @@
     <w:semiHidden/>
     <w:unhideWhenUsed/>
     <w:qFormat/>
-    <w:rsid w:val="00D67BB9"/>
+    <w:rsid w:val="00A02481"/>
     <w:pPr>
       <w:keepNext/>
       <w:keepLines/>
@@ -597,7 +2099,7 @@
     <w:semiHidden/>
     <w:unhideWhenUsed/>
     <w:qFormat/>
-    <w:rsid w:val="00D67BB9"/>
+    <w:rsid w:val="00A02481"/>
     <w:pPr>
       <w:keepNext/>
       <w:keepLines/>
@@ -620,7 +2122,7 @@
     <w:semiHidden/>
     <w:unhideWhenUsed/>
     <w:qFormat/>
-    <w:rsid w:val="00D67BB9"/>
+    <w:rsid w:val="00A02481"/>
     <w:pPr>
       <w:keepNext/>
       <w:keepLines/>
@@ -641,7 +2143,7 @@
     <w:semiHidden/>
     <w:unhideWhenUsed/>
     <w:qFormat/>
-    <w:rsid w:val="00D67BB9"/>
+    <w:rsid w:val="00A02481"/>
     <w:pPr>
       <w:keepNext/>
       <w:keepLines/>
@@ -664,7 +2166,7 @@
     <w:semiHidden/>
     <w:unhideWhenUsed/>
     <w:qFormat/>
-    <w:rsid w:val="00D67BB9"/>
+    <w:rsid w:val="00A02481"/>
     <w:pPr>
       <w:keepNext/>
       <w:keepLines/>
@@ -707,7 +2209,7 @@
     <w:basedOn w:val="Fontepargpadro"/>
     <w:link w:val="Ttulo1"/>
     <w:uiPriority w:val="9"/>
-    <w:rsid w:val="00D67BB9"/>
+    <w:rsid w:val="00A02481"/>
     <w:rPr>
       <w:rFonts w:asciiTheme="majorHAnsi" w:eastAsiaTheme="majorEastAsia" w:hAnsiTheme="majorHAnsi" w:cstheme="majorBidi"/>
       <w:color w:val="0F4761" w:themeColor="accent1" w:themeShade="BF"/>
@@ -721,7 +2223,7 @@
     <w:link w:val="Ttulo2"/>
     <w:uiPriority w:val="9"/>
     <w:semiHidden/>
-    <w:rsid w:val="00D67BB9"/>
+    <w:rsid w:val="00A02481"/>
     <w:rPr>
       <w:rFonts w:asciiTheme="majorHAnsi" w:eastAsiaTheme="majorEastAsia" w:hAnsiTheme="majorHAnsi" w:cstheme="majorBidi"/>
       <w:color w:val="0F4761" w:themeColor="accent1" w:themeShade="BF"/>
@@ -735,7 +2237,7 @@
     <w:link w:val="Ttulo3"/>
     <w:uiPriority w:val="9"/>
     <w:semiHidden/>
-    <w:rsid w:val="00D67BB9"/>
+    <w:rsid w:val="00A02481"/>
     <w:rPr>
       <w:rFonts w:eastAsiaTheme="majorEastAsia" w:cstheme="majorBidi"/>
       <w:color w:val="0F4761" w:themeColor="accent1" w:themeShade="BF"/>
@@ -749,7 +2251,7 @@
     <w:link w:val="Ttulo4"/>
     <w:uiPriority w:val="9"/>
     <w:semiHidden/>
-    <w:rsid w:val="00D67BB9"/>
+    <w:rsid w:val="00A02481"/>
     <w:rPr>
       <w:rFonts w:eastAsiaTheme="majorEastAsia" w:cstheme="majorBidi"/>
       <w:i/>
@@ -763,7 +2265,7 @@
     <w:link w:val="Ttulo5"/>
     <w:uiPriority w:val="9"/>
     <w:semiHidden/>
-    <w:rsid w:val="00D67BB9"/>
+    <w:rsid w:val="00A02481"/>
     <w:rPr>
       <w:rFonts w:eastAsiaTheme="majorEastAsia" w:cstheme="majorBidi"/>
       <w:color w:val="0F4761" w:themeColor="accent1" w:themeShade="BF"/>
@@ -775,7 +2277,7 @@
     <w:link w:val="Ttulo6"/>
     <w:uiPriority w:val="9"/>
     <w:semiHidden/>
-    <w:rsid w:val="00D67BB9"/>
+    <w:rsid w:val="00A02481"/>
     <w:rPr>
       <w:rFonts w:eastAsiaTheme="majorEastAsia" w:cstheme="majorBidi"/>
       <w:i/>
@@ -789,7 +2291,7 @@
     <w:link w:val="Ttulo7"/>
     <w:uiPriority w:val="9"/>
     <w:semiHidden/>
-    <w:rsid w:val="00D67BB9"/>
+    <w:rsid w:val="00A02481"/>
     <w:rPr>
       <w:rFonts w:eastAsiaTheme="majorEastAsia" w:cstheme="majorBidi"/>
       <w:color w:val="595959" w:themeColor="text1" w:themeTint="A6"/>
@@ -801,7 +2303,7 @@
     <w:link w:val="Ttulo8"/>
     <w:uiPriority w:val="9"/>
     <w:semiHidden/>
-    <w:rsid w:val="00D67BB9"/>
+    <w:rsid w:val="00A02481"/>
     <w:rPr>
       <w:rFonts w:eastAsiaTheme="majorEastAsia" w:cstheme="majorBidi"/>
       <w:i/>
@@ -815,7 +2317,7 @@
     <w:link w:val="Ttulo9"/>
     <w:uiPriority w:val="9"/>
     <w:semiHidden/>
-    <w:rsid w:val="00D67BB9"/>
+    <w:rsid w:val="00A02481"/>
     <w:rPr>
       <w:rFonts w:eastAsiaTheme="majorEastAsia" w:cstheme="majorBidi"/>
       <w:color w:val="272727" w:themeColor="text1" w:themeTint="D8"/>
@@ -828,7 +2330,7 @@
     <w:link w:val="TtuloChar"/>
     <w:uiPriority w:val="10"/>
     <w:qFormat/>
-    <w:rsid w:val="00D67BB9"/>
+    <w:rsid w:val="00A02481"/>
     <w:pPr>
       <w:spacing w:after="80" w:line="240" w:lineRule="auto"/>
       <w:contextualSpacing/>
@@ -846,7 +2348,7 @@
     <w:basedOn w:val="Fontepargpadro"/>
     <w:link w:val="Ttulo"/>
     <w:uiPriority w:val="10"/>
-    <w:rsid w:val="00D67BB9"/>
+    <w:rsid w:val="00A02481"/>
     <w:rPr>
       <w:rFonts w:asciiTheme="majorHAnsi" w:eastAsiaTheme="majorEastAsia" w:hAnsiTheme="majorHAnsi" w:cstheme="majorBidi"/>
       <w:spacing w:val="-10"/>
@@ -862,7 +2364,7 @@
     <w:link w:val="SubttuloChar"/>
     <w:uiPriority w:val="11"/>
     <w:qFormat/>
-    <w:rsid w:val="00D67BB9"/>
+    <w:rsid w:val="00A02481"/>
     <w:pPr>
       <w:numPr>
         <w:ilvl w:val="1"/>
@@ -881,7 +2383,7 @@
     <w:basedOn w:val="Fontepargpadro"/>
     <w:link w:val="Subttulo"/>
     <w:uiPriority w:val="11"/>
-    <w:rsid w:val="00D67BB9"/>
+    <w:rsid w:val="00A02481"/>
     <w:rPr>
       <w:rFonts w:eastAsiaTheme="majorEastAsia" w:cstheme="majorBidi"/>
       <w:color w:val="595959" w:themeColor="text1" w:themeTint="A6"/>
@@ -897,7 +2399,7 @@
     <w:link w:val="CitaoChar"/>
     <w:uiPriority w:val="29"/>
     <w:qFormat/>
-    <w:rsid w:val="00D67BB9"/>
+    <w:rsid w:val="00A02481"/>
     <w:pPr>
       <w:spacing w:before="160"/>
       <w:jc w:val="center"/>
@@ -913,7 +2415,7 @@
     <w:basedOn w:val="Fontepargpadro"/>
     <w:link w:val="Citao"/>
     <w:uiPriority w:val="29"/>
-    <w:rsid w:val="00D67BB9"/>
+    <w:rsid w:val="00A02481"/>
     <w:rPr>
       <w:i/>
       <w:iCs/>
@@ -925,7 +2427,7 @@
     <w:basedOn w:val="Normal"/>
     <w:uiPriority w:val="34"/>
     <w:qFormat/>
-    <w:rsid w:val="00D67BB9"/>
+    <w:rsid w:val="00A02481"/>
     <w:pPr>
       <w:ind w:left="720"/>
       <w:contextualSpacing/>
@@ -936,7 +2438,7 @@
     <w:basedOn w:val="Fontepargpadro"/>
     <w:uiPriority w:val="21"/>
     <w:qFormat/>
-    <w:rsid w:val="00D67BB9"/>
+    <w:rsid w:val="00A02481"/>
     <w:rPr>
       <w:i/>
       <w:iCs/>
@@ -950,7 +2452,7 @@
     <w:link w:val="CitaoIntensaChar"/>
     <w:uiPriority w:val="30"/>
     <w:qFormat/>
-    <w:rsid w:val="00D67BB9"/>
+    <w:rsid w:val="00A02481"/>
     <w:pPr>
       <w:pBdr>
         <w:top w:val="single" w:sz="4" w:space="10" w:color="0F4761" w:themeColor="accent1" w:themeShade="BF"/>
@@ -971,7 +2473,7 @@
     <w:basedOn w:val="Fontepargpadro"/>
     <w:link w:val="CitaoIntensa"/>
     <w:uiPriority w:val="30"/>
-    <w:rsid w:val="00D67BB9"/>
+    <w:rsid w:val="00A02481"/>
     <w:rPr>
       <w:i/>
       <w:iCs/>
@@ -983,13 +2485,36 @@
     <w:basedOn w:val="Fontepargpadro"/>
     <w:uiPriority w:val="32"/>
     <w:qFormat/>
-    <w:rsid w:val="00D67BB9"/>
+    <w:rsid w:val="00A02481"/>
     <w:rPr>
       <w:b/>
       <w:bCs/>
       <w:smallCaps/>
       <w:color w:val="0F4761" w:themeColor="accent1" w:themeShade="BF"/>
       <w:spacing w:val="5"/>
+    </w:rPr>
+  </w:style>
+  <w:style w:type="character" w:styleId="Hyperlink">
+    <w:name w:val="Hyperlink"/>
+    <w:basedOn w:val="Fontepargpadro"/>
+    <w:uiPriority w:val="99"/>
+    <w:unhideWhenUsed/>
+    <w:rsid w:val="00A02481"/>
+    <w:rPr>
+      <w:color w:val="467886" w:themeColor="hyperlink"/>
+      <w:u w:val="single"/>
+    </w:rPr>
+  </w:style>
+  <w:style w:type="character" w:styleId="MenoPendente">
+    <w:name w:val="Unresolved Mention"/>
+    <w:basedOn w:val="Fontepargpadro"/>
+    <w:uiPriority w:val="99"/>
+    <w:semiHidden/>
+    <w:unhideWhenUsed/>
+    <w:rsid w:val="00A02481"/>
+    <w:rPr>
+      <w:color w:val="605E5C"/>
+      <w:shd w:val="clear" w:color="auto" w:fill="E1DFDD"/>
     </w:rPr>
   </w:style>
 </w:styles>

</xml_diff>